<commit_message>
Actualización del archivo EDT-WBS - Eventra
</commit_message>
<xml_diff>
--- a/docs/EDT-WBS - Eventra.docx
+++ b/docs/EDT-WBS - Eventra.docx
@@ -1,6 +1,6 @@
 
 <file path=word/document.xml><?xml version="1.0" encoding="utf-8"?>
-<w:document xmlns:wpc="http://schemas.microsoft.com/office/word/2010/wordprocessingCanvas" xmlns:cx="http://schemas.microsoft.com/office/drawing/2014/chartex" xmlns:cx1="http://schemas.microsoft.com/office/drawing/2015/9/8/chartex" xmlns:cx2="http://schemas.microsoft.com/office/drawing/2015/10/21/chartex" xmlns:cx3="http://schemas.microsoft.com/office/drawing/2016/5/9/chartex" xmlns:cx4="http://schemas.microsoft.com/office/drawing/2016/5/10/chartex" xmlns:cx5="http://schemas.microsoft.com/office/drawing/2016/5/11/chartex" xmlns:cx6="http://schemas.microsoft.com/office/drawing/2016/5/12/chartex" xmlns:cx7="http://schemas.microsoft.com/office/drawing/2016/5/13/chartex" xmlns:cx8="http://schemas.microsoft.com/office/drawing/2016/5/14/chartex" xmlns:mc="http://schemas.openxmlformats.org/markup-compatibility/2006" xmlns:aink="http://schemas.microsoft.com/office/drawing/2016/ink" xmlns:am3d="http://schemas.microsoft.com/office/drawing/2017/model3d" xmlns:o="urn:schemas-microsoft-com:office:office" xmlns:oel="http://schemas.microsoft.com/office/2019/extlst" xmlns:r="http://schemas.openxmlformats.org/officeDocument/2006/relationships" xmlns:m="http://schemas.openxmlformats.org/officeDocument/2006/math" xmlns:v="urn:schemas-microsoft-com:vml" xmlns:wp14="http://schemas.microsoft.com/office/word/2010/wordprocessingDrawing" xmlns:wp="http://schemas.openxmlformats.org/drawingml/2006/wordprocessingDrawing" xmlns:w10="urn:schemas-microsoft-com:office:word" xmlns:w="http://schemas.openxmlformats.org/wordprocessingml/2006/main" xmlns:w14="http://schemas.microsoft.com/office/word/2010/wordml" xmlns:w15="http://schemas.microsoft.com/office/word/2012/wordml" xmlns:w16cex="http://schemas.microsoft.com/office/word/2018/wordml/cex" xmlns:w16cid="http://schemas.microsoft.com/office/word/2016/wordml/cid" xmlns:w16="http://schemas.microsoft.com/office/word/2018/wordml" xmlns:w16du="http://schemas.microsoft.com/office/word/2023/wordml/word16du" xmlns:w16sdtdh="http://schemas.microsoft.com/office/word/2020/wordml/sdtdatahash" xmlns:w16sdtfl="http://schemas.microsoft.com/office/word/2024/wordml/sdtformatlock" xmlns:w16se="http://schemas.microsoft.com/office/word/2015/wordml/symex" xmlns:wpg="http://schemas.microsoft.com/office/word/2010/wordprocessingGroup" xmlns:wpi="http://schemas.microsoft.com/office/word/2010/wordprocessingInk" xmlns:wne="http://schemas.microsoft.com/office/word/2006/wordml" xmlns:wps="http://schemas.microsoft.com/office/word/2010/wordprocessingShape" mc:Ignorable="w14 w15 w16se w16cid w16 w16cex w16sdtdh w16sdtfl w16du wp14">
+<w:document xmlns:wpc="http://schemas.microsoft.com/office/word/2010/wordprocessingCanvas" xmlns:cx="http://schemas.microsoft.com/office/drawing/2014/chartex" xmlns:cx1="http://schemas.microsoft.com/office/drawing/2015/9/8/chartex" xmlns:cx2="http://schemas.microsoft.com/office/drawing/2015/10/21/chartex" xmlns:cx3="http://schemas.microsoft.com/office/drawing/2016/5/9/chartex" xmlns:cx4="http://schemas.microsoft.com/office/drawing/2016/5/10/chartex" xmlns:cx5="http://schemas.microsoft.com/office/drawing/2016/5/11/chartex" xmlns:cx6="http://schemas.microsoft.com/office/drawing/2016/5/12/chartex" xmlns:cx7="http://schemas.microsoft.com/office/drawing/2016/5/13/chartex" xmlns:cx8="http://schemas.microsoft.com/office/drawing/2016/5/14/chartex" xmlns:mc="http://schemas.openxmlformats.org/markup-compatibility/2006" xmlns:aink="http://schemas.microsoft.com/office/drawing/2016/ink" xmlns:am3d="http://schemas.microsoft.com/office/drawing/2017/model3d" xmlns:o="urn:schemas-microsoft-com:office:office" xmlns:oel="http://schemas.microsoft.com/office/2019/extlst" xmlns:r="http://schemas.openxmlformats.org/officeDocument/2006/relationships" xmlns:m="http://schemas.openxmlformats.org/officeDocument/2006/math" xmlns:v="urn:schemas-microsoft-com:vml" xmlns:wp14="http://schemas.microsoft.com/office/word/2010/wordprocessingDrawing" xmlns:wp="http://schemas.openxmlformats.org/drawingml/2006/wordprocessingDrawing" xmlns:w10="urn:schemas-microsoft-com:office:word" xmlns:w="http://schemas.openxmlformats.org/wordprocessingml/2006/main" xmlns:w14="http://schemas.microsoft.com/office/word/2010/wordml" xmlns:w15="http://schemas.microsoft.com/office/word/2012/wordml" xmlns:w16cex="http://schemas.microsoft.com/office/word/2018/wordml/cex" xmlns:w16cid="http://schemas.microsoft.com/office/word/2016/wordml/cid" xmlns:w16="http://schemas.microsoft.com/office/word/2018/wordml" xmlns:w16du="http://schemas.microsoft.com/office/word/2023/wordml/word16du" xmlns:w16sdtdh="http://schemas.microsoft.com/office/word/2020/wordml/sdtdatahash" xmlns:w16sdtfl="http://schemas.microsoft.com/office/word/2024/wordml/sdtformatlock" xmlns:w16se="http://schemas.microsoft.com/office/word/2015/wordml/symex" xmlns:wpg="http://schemas.microsoft.com/office/word/2010/wordprocessingGroup" xmlns:wpi="http://schemas.microsoft.com/office/word/2010/wordprocessingInk" xmlns:wne="http://schemas.microsoft.com/office/word/2006/wordml" xmlns:wps="http://schemas.microsoft.com/office/word/2010/wordprocessingShape" xmlns:a="http://schemas.openxmlformats.org/drawingml/2006/main" xmlns:pic="http://schemas.openxmlformats.org/drawingml/2006/picture" xmlns:a14="http://schemas.microsoft.com/office/drawing/2010/main" mc:Ignorable="w14 w15 w16se w16cid w16 w16cex w16sdtdh w16sdtfl w16du wp14">
   <w:body>
     <w:p>
       <w:pPr>
@@ -127,18 +127,26 @@
       </w:r>
       <w:r>
         <w:br/>
+      </w:r>
+      <w:r>
         <w:t>1.1.2 Planificación inicial</w:t>
       </w:r>
       <w:r>
         <w:br/>
+      </w:r>
+      <w:r>
         <w:t>1.1.3 Organización del backlog</w:t>
       </w:r>
       <w:r>
         <w:br/>
+      </w:r>
+      <w:r>
         <w:t>1.1.4 Configuración de Jira</w:t>
       </w:r>
       <w:r>
         <w:br/>
+      </w:r>
+      <w:r>
         <w:t xml:space="preserve">1.1.5 Gestión de </w:t>
       </w:r>
       <w:proofErr w:type="spellStart"/>
@@ -148,14 +156,20 @@
       <w:proofErr w:type="spellEnd"/>
       <w:r>
         <w:br/>
+      </w:r>
+      <w:r>
         <w:t>1.1.6 Seguimiento y control</w:t>
       </w:r>
       <w:r>
         <w:br/>
+      </w:r>
+      <w:r>
         <w:t>1.1.7 Gestión de riesgos</w:t>
       </w:r>
       <w:r>
         <w:br/>
+      </w:r>
+      <w:r>
         <w:t>1.1.8 Control documental</w:t>
       </w:r>
     </w:p>
@@ -176,33 +190,44 @@
       </w:r>
       <w:r>
         <w:br/>
+      </w:r>
+      <w:r>
         <w:t>1.2.2 Identificación de objetivos del sistema</w:t>
       </w:r>
       <w:r>
         <w:br/>
+      </w:r>
+      <w:r>
         <w:t>1.2.3 Identificación de actores y usuarios</w:t>
       </w:r>
       <w:r>
         <w:br/>
+      </w:r>
+      <w:r>
         <w:t>1.2.4 Definición de requerimientos funcionales</w:t>
       </w:r>
       <w:r>
         <w:br/>
       </w:r>
       <w:r>
-        <w:lastRenderedPageBreak/>
         <w:t>1.2.5 Definición de requerimientos no funcionales</w:t>
       </w:r>
       <w:r>
         <w:br/>
+      </w:r>
+      <w:r>
         <w:t>1.2.6 Elaboración de casos de uso</w:t>
       </w:r>
       <w:r>
         <w:br/>
+      </w:r>
+      <w:r>
         <w:t>1.2.7 Delimitación del MVP</w:t>
       </w:r>
       <w:r>
         <w:br/>
+      </w:r>
+      <w:r>
         <w:t xml:space="preserve">1.2.8 Priorización por </w:t>
       </w:r>
       <w:proofErr w:type="spellStart"/>
@@ -228,10 +253,14 @@
       </w:r>
       <w:r>
         <w:br/>
+      </w:r>
+      <w:r>
         <w:t>1.3.2 Diseño de microservicios</w:t>
       </w:r>
       <w:r>
         <w:br/>
+      </w:r>
+      <w:r>
         <w:t xml:space="preserve">1.3.3 Diseño de </w:t>
       </w:r>
       <w:proofErr w:type="spellStart"/>
@@ -249,10 +278,14 @@
       <w:proofErr w:type="spellEnd"/>
       <w:r>
         <w:br/>
+      </w:r>
+      <w:r>
         <w:t>1.3.4 Diseño del modelo relacional</w:t>
       </w:r>
       <w:r>
         <w:br/>
+      </w:r>
+      <w:r>
         <w:t xml:space="preserve">1.3.5 Diseño de interfaces en </w:t>
       </w:r>
       <w:proofErr w:type="spellStart"/>
@@ -262,10 +295,14 @@
       <w:proofErr w:type="spellEnd"/>
       <w:r>
         <w:br/>
+      </w:r>
+      <w:r>
         <w:t>1.3.6 Conversión del diseño a Android XML</w:t>
       </w:r>
       <w:r>
         <w:br/>
+      </w:r>
+      <w:r>
         <w:t xml:space="preserve">1.3.7 Definición de identidad visual </w:t>
       </w:r>
       <w:proofErr w:type="spellStart"/>
@@ -291,6 +328,8 @@
       </w:r>
       <w:r>
         <w:br/>
+      </w:r>
+      <w:r>
         <w:t xml:space="preserve">1.4.2 Estructura base del </w:t>
       </w:r>
       <w:proofErr w:type="spellStart"/>
@@ -300,10 +339,14 @@
       <w:proofErr w:type="spellEnd"/>
       <w:r>
         <w:br/>
+      </w:r>
+      <w:r>
         <w:t>1.4.3 Desarrollo de pantalla de registro</w:t>
       </w:r>
       <w:r>
         <w:br/>
+      </w:r>
+      <w:r>
         <w:t xml:space="preserve">1.4.4 Desarrollo de pantalla de </w:t>
       </w:r>
       <w:proofErr w:type="spellStart"/>
@@ -313,14 +356,20 @@
       <w:proofErr w:type="spellEnd"/>
       <w:r>
         <w:br/>
+      </w:r>
+      <w:r>
         <w:t>1.4.5 Validaciones de formularios</w:t>
       </w:r>
       <w:r>
         <w:br/>
+      </w:r>
+      <w:r>
         <w:t>1.4.6 Navegación base entre pantallas</w:t>
       </w:r>
       <w:r>
         <w:br/>
+      </w:r>
+      <w:r>
         <w:t xml:space="preserve">1.4.7 Desarrollo del microservicio </w:t>
       </w:r>
       <w:proofErr w:type="spellStart"/>
@@ -330,6 +379,8 @@
       <w:proofErr w:type="spellEnd"/>
       <w:r>
         <w:br/>
+      </w:r>
+      <w:r>
         <w:t xml:space="preserve">1.4.8 Desarrollo del microservicio </w:t>
       </w:r>
       <w:proofErr w:type="spellStart"/>
@@ -339,6 +390,8 @@
       <w:proofErr w:type="spellEnd"/>
       <w:r>
         <w:br/>
+      </w:r>
+      <w:r>
         <w:t xml:space="preserve">1.4.9 Integración </w:t>
       </w:r>
       <w:proofErr w:type="spellStart"/>
@@ -348,6 +401,8 @@
       <w:proofErr w:type="spellEnd"/>
       <w:r>
         <w:br/>
+      </w:r>
+      <w:r>
         <w:t xml:space="preserve">1.4.10 Integración </w:t>
       </w:r>
       <w:proofErr w:type="spellStart"/>
@@ -357,6 +412,8 @@
       <w:proofErr w:type="spellEnd"/>
       <w:r>
         <w:br/>
+      </w:r>
+      <w:r>
         <w:t xml:space="preserve">1.4.11 Pruebas de registro y </w:t>
       </w:r>
       <w:proofErr w:type="spellStart"/>
@@ -366,6 +423,8 @@
       <w:proofErr w:type="spellEnd"/>
       <w:r>
         <w:br/>
+      </w:r>
+      <w:r>
         <w:t>1.4.12 Consolidación técnica del sprint</w:t>
       </w:r>
     </w:p>
@@ -386,10 +445,14 @@
       </w:r>
       <w:r>
         <w:br/>
+      </w:r>
+      <w:r>
         <w:t>1.5.2 Diseño del flujo de eventos</w:t>
       </w:r>
       <w:r>
         <w:br/>
+      </w:r>
+      <w:r>
         <w:t xml:space="preserve">1.5.3 Desarrollo </w:t>
       </w:r>
       <w:proofErr w:type="spellStart"/>
@@ -402,6 +465,8 @@
       </w:r>
       <w:r>
         <w:br/>
+      </w:r>
+      <w:r>
         <w:t xml:space="preserve">1.5.4 Desarrollo </w:t>
       </w:r>
       <w:proofErr w:type="spellStart"/>
@@ -414,26 +479,38 @@
       </w:r>
       <w:r>
         <w:br/>
+      </w:r>
+      <w:r>
         <w:t>1.5.5 Desarrollo de detalle de evento</w:t>
       </w:r>
       <w:r>
         <w:br/>
+      </w:r>
+      <w:r>
         <w:t>1.5.6 Desarrollo del flujo de creación de evento</w:t>
       </w:r>
       <w:r>
         <w:br/>
+      </w:r>
+      <w:r>
         <w:t>1.5.7 Desarrollo del flujo de inscripción</w:t>
       </w:r>
       <w:r>
         <w:br/>
+      </w:r>
+      <w:r>
         <w:t>1.5.8 Validaciones de cupos y estado</w:t>
       </w:r>
       <w:r>
         <w:br/>
+      </w:r>
+      <w:r>
         <w:t>1.5.9 Integración del módulo de eventos</w:t>
       </w:r>
       <w:r>
         <w:br/>
+      </w:r>
+      <w:r>
         <w:t>1.5.10 Pruebas del MVP de eventos</w:t>
       </w:r>
     </w:p>
@@ -450,47 +527,66 @@
         <w:pStyle w:val="EventraParrafos"/>
       </w:pPr>
       <w:r>
-        <w:lastRenderedPageBreak/>
         <w:t>1.6.1 Edición de evento</w:t>
       </w:r>
       <w:r>
         <w:br/>
+      </w:r>
+      <w:r>
         <w:t>1.6.2 Administración del estado del evento</w:t>
       </w:r>
       <w:r>
         <w:br/>
+      </w:r>
+      <w:r>
         <w:t>1.6.3 Publicación de novedades</w:t>
       </w:r>
       <w:r>
         <w:br/>
+      </w:r>
+      <w:r>
         <w:t>1.6.4 Gestión de participantes</w:t>
       </w:r>
       <w:r>
         <w:br/>
+      </w:r>
+      <w:r>
         <w:t>1.6.5 Consulta de mis eventos</w:t>
       </w:r>
       <w:r>
         <w:br/>
+      </w:r>
+      <w:r>
         <w:t>1.6.6 Consulta del estado de inscripción</w:t>
       </w:r>
       <w:r>
         <w:br/>
+      </w:r>
+      <w:r>
         <w:t>1.6.7 Cancelación de inscripción</w:t>
       </w:r>
       <w:r>
         <w:br/>
+      </w:r>
+      <w:r>
         <w:t>1.6.8 Visualización logística del evento</w:t>
       </w:r>
       <w:r>
         <w:br/>
+      </w:r>
+      <w:r>
         <w:t>1.6.9 Gestión ampliada de perfil</w:t>
       </w:r>
       <w:r>
         <w:br/>
+      </w:r>
+      <w:r>
         <w:t>1.6.10 Integración funcional del sprint</w:t>
       </w:r>
       <w:r>
         <w:br/>
+      </w:r>
+      <w:r>
         <w:t>1.6.11 Pruebas y correcciones</w:t>
       </w:r>
     </w:p>
@@ -511,42 +607,62 @@
       </w:r>
       <w:r>
         <w:br/>
+      </w:r>
+      <w:r>
         <w:t>1.7.2 Solicitud y gestión de permisos de ubicación</w:t>
       </w:r>
       <w:r>
         <w:br/>
+      </w:r>
+      <w:r>
         <w:t>1.7.3 Captura de ubicación en tiempo real</w:t>
       </w:r>
       <w:r>
         <w:br/>
+      </w:r>
+      <w:r>
         <w:t>1.7.4 Cálculo de distancia recorrida</w:t>
       </w:r>
       <w:r>
         <w:br/>
+      </w:r>
+      <w:r>
         <w:t>1.7.5 Cálculo de tiempo transcurrido</w:t>
       </w:r>
       <w:r>
         <w:br/>
+      </w:r>
+      <w:r>
         <w:t>1.7.6 Visualización del recorrido</w:t>
       </w:r>
       <w:r>
         <w:br/>
+      </w:r>
+      <w:r>
         <w:t>1.7.7 Interfaz de inicio de actividad</w:t>
       </w:r>
       <w:r>
         <w:br/>
+      </w:r>
+      <w:r>
         <w:t>1.7.8 Interfaz de seguimiento</w:t>
       </w:r>
       <w:r>
         <w:br/>
+      </w:r>
+      <w:r>
         <w:t>1.7.9 Interfaz de resumen final</w:t>
       </w:r>
       <w:r>
         <w:br/>
+      </w:r>
+      <w:r>
         <w:t>1.7.10 Integración del módulo GPS</w:t>
       </w:r>
       <w:r>
         <w:br/>
+      </w:r>
+      <w:r>
         <w:t>1.7.11 Pruebas funcionales de tracking</w:t>
       </w:r>
     </w:p>
@@ -567,6 +683,8 @@
       </w:r>
       <w:r>
         <w:br/>
+      </w:r>
+      <w:r>
         <w:t xml:space="preserve">1.8.2 Esquema del microservicio </w:t>
       </w:r>
       <w:proofErr w:type="spellStart"/>
@@ -576,6 +694,8 @@
       <w:proofErr w:type="spellEnd"/>
       <w:r>
         <w:br/>
+      </w:r>
+      <w:r>
         <w:t xml:space="preserve">1.8.3 Esquema del microservicio </w:t>
       </w:r>
       <w:proofErr w:type="spellStart"/>
@@ -585,14 +705,20 @@
       <w:proofErr w:type="spellEnd"/>
       <w:r>
         <w:br/>
+      </w:r>
+      <w:r>
         <w:t>1.8.4 Modelado de datos del módulo de eventos</w:t>
       </w:r>
       <w:r>
         <w:br/>
+      </w:r>
+      <w:r>
         <w:t>1.8.5 Ajustes de base de datos por sprint</w:t>
       </w:r>
       <w:r>
         <w:br/>
+      </w:r>
+      <w:r>
         <w:t>1.8.6 Validación de integridad lógica</w:t>
       </w:r>
     </w:p>
@@ -631,22 +757,32 @@
       <w:proofErr w:type="spellEnd"/>
       <w:r>
         <w:br/>
+      </w:r>
+      <w:r>
         <w:t>1.9.2 Pruebas de validación de formularios</w:t>
       </w:r>
       <w:r>
         <w:br/>
+      </w:r>
+      <w:r>
         <w:t>1.9.3 Pruebas de integración</w:t>
       </w:r>
       <w:r>
         <w:br/>
+      </w:r>
+      <w:r>
         <w:t>1.9.4 Corrección de errores</w:t>
       </w:r>
       <w:r>
         <w:br/>
+      </w:r>
+      <w:r>
         <w:t>1.9.5 Validación por sprint</w:t>
       </w:r>
       <w:r>
         <w:br/>
+      </w:r>
+      <w:r>
         <w:t>1.9.6 Revisión funcional final</w:t>
       </w:r>
     </w:p>
@@ -655,7 +791,6 @@
         <w:pStyle w:val="EventraParrafos"/>
       </w:pPr>
       <w:r>
-        <w:lastRenderedPageBreak/>
         <w:t>1.10 Documentación</w:t>
       </w:r>
     </w:p>
@@ -668,38 +803,56 @@
       </w:r>
       <w:r>
         <w:br/>
+      </w:r>
+      <w:r>
         <w:t>1.10.2 Documento general del proyecto</w:t>
       </w:r>
       <w:r>
         <w:br/>
+      </w:r>
+      <w:r>
         <w:t>1.10.3 Documento de microservicios</w:t>
       </w:r>
       <w:r>
         <w:br/>
+      </w:r>
+      <w:r>
         <w:t>1.10.4 Documento de requerimientos</w:t>
       </w:r>
       <w:r>
         <w:br/>
+      </w:r>
+      <w:r>
         <w:t>1.10.5 Acta de constitución</w:t>
       </w:r>
       <w:r>
         <w:br/>
+      </w:r>
+      <w:r>
         <w:t>1.10.6 Casos de uso</w:t>
       </w:r>
       <w:r>
         <w:br/>
+      </w:r>
+      <w:r>
         <w:t>1.10.7 EDT / WBS</w:t>
       </w:r>
       <w:r>
         <w:br/>
+      </w:r>
+      <w:r>
         <w:t>1.10.8 Modelo relacional</w:t>
       </w:r>
       <w:r>
         <w:br/>
+      </w:r>
+      <w:r>
         <w:t>1.10.9 Evidencias de pruebas</w:t>
       </w:r>
       <w:r>
         <w:br/>
+      </w:r>
+      <w:r>
         <w:t>1.10.10 Entrega final académica</w:t>
       </w:r>
     </w:p>
@@ -720,18 +873,26 @@
       </w:r>
       <w:r>
         <w:br/>
+      </w:r>
+      <w:r>
         <w:t>1.11.2 Revisión integral del sistema</w:t>
       </w:r>
       <w:r>
         <w:br/>
+      </w:r>
+      <w:r>
         <w:t>1.11.3 Ajustes finales</w:t>
       </w:r>
       <w:r>
         <w:br/>
+      </w:r>
+      <w:r>
         <w:t>1.11.4 Preparación de presentación</w:t>
       </w:r>
       <w:r>
         <w:br/>
+      </w:r>
+      <w:r>
         <w:t>1.11.5 Cierre académico del proyecto</w:t>
       </w:r>
     </w:p>
@@ -762,46 +923,68 @@
       <w:proofErr w:type="spellEnd"/>
       <w:r>
         <w:br/>
+      </w:r>
+      <w:r>
         <w:t xml:space="preserve">  1.1 Dirección y gestión del proyecto</w:t>
       </w:r>
       <w:r>
         <w:br/>
+      </w:r>
+      <w:r>
         <w:t xml:space="preserve">  1.2 Análisis y definición del producto</w:t>
       </w:r>
       <w:r>
         <w:br/>
+      </w:r>
+      <w:r>
         <w:t xml:space="preserve">  1.3 Diseño funcional y técnico</w:t>
       </w:r>
       <w:r>
         <w:br/>
+      </w:r>
+      <w:r>
         <w:t xml:space="preserve">  1.4 Sprint 1 – Base del sistema, autenticación y usuario</w:t>
       </w:r>
       <w:r>
         <w:br/>
+      </w:r>
+      <w:r>
         <w:t xml:space="preserve">  1.5 Sprint 2 – MVP de eventos, creación e inscripción</w:t>
       </w:r>
       <w:r>
         <w:br/>
+      </w:r>
+      <w:r>
         <w:t xml:space="preserve">  1.6 Sprint 3 – Funcionalidad avanzada de eventos, perfil y participación</w:t>
       </w:r>
       <w:r>
         <w:br/>
+      </w:r>
+      <w:r>
         <w:t xml:space="preserve">  1.7 Sprint 4 – Seguimiento con GPS, tiempo y distancia</w:t>
       </w:r>
       <w:r>
         <w:br/>
+      </w:r>
+      <w:r>
         <w:t xml:space="preserve">  1.8 Base de datos</w:t>
       </w:r>
       <w:r>
         <w:br/>
+      </w:r>
+      <w:r>
         <w:t xml:space="preserve">  1.9 Calidad y pruebas</w:t>
       </w:r>
       <w:r>
         <w:br/>
+      </w:r>
+      <w:r>
         <w:t xml:space="preserve">  1.10 Documentación</w:t>
       </w:r>
       <w:r>
         <w:br/>
+      </w:r>
+      <w:r>
         <w:t xml:space="preserve">  1.11 Cierre del proyecto</w:t>
       </w:r>
     </w:p>
@@ -812,13 +995,24 @@
     </w:p>
     <w:p>
       <w:pPr>
+        <w:pStyle w:val="EventraParrafos"/>
+      </w:pPr>
+    </w:p>
+    <w:p>
+      <w:pPr>
+        <w:pStyle w:val="EventraParrafos"/>
+      </w:pPr>
+    </w:p>
+    <w:p>
+      <w:pPr>
         <w:pStyle w:val="EventraTitle3"/>
       </w:pPr>
       <w:r>
-        <w:lastRenderedPageBreak/>
+        <w:rPr/>
         <w:t xml:space="preserve">5. EDT </w:t>
       </w:r>
       <w:r>
+        <w:rPr/>
         <w:t>/ WBS</w:t>
       </w:r>
     </w:p>
@@ -828,30 +1022,36 @@
       </w:pPr>
       <w:r>
         <w:drawing>
-          <wp:inline distT="0" distB="0" distL="0" distR="0" wp14:anchorId="04F17FA5" wp14:editId="6F7D2EE6">
-            <wp:extent cx="1171456" cy="7793665"/>
+          <wp:inline wp14:editId="53A26340" wp14:anchorId="2DD68DB0">
+            <wp:extent cx="5574190" cy="3600000"/>
             <wp:effectExtent l="0" t="0" r="0" b="0"/>
-            <wp:docPr id="711360739" name="Imagen 1"/>
+            <wp:docPr id="180394524" name="drawing"/>
             <wp:cNvGraphicFramePr>
-              <a:graphicFrameLocks xmlns:a="http://schemas.openxmlformats.org/drawingml/2006/main" noChangeAspect="1"/>
+              <a:graphicFrameLocks noChangeAspect="1"/>
             </wp:cNvGraphicFramePr>
-            <a:graphic xmlns:a="http://schemas.openxmlformats.org/drawingml/2006/main">
-              <a:graphicData uri="http://schemas.openxmlformats.org/drawingml/2006/picture">
+            <a:graphic>
+              <a:graphicData xmlns:a="http://schemas.openxmlformats.org/drawingml/2006/main" uri="http://schemas.openxmlformats.org/drawingml/2006/picture">
                 <pic:pic xmlns:pic="http://schemas.openxmlformats.org/drawingml/2006/picture">
                   <pic:nvPicPr>
-                    <pic:cNvPr id="711360739" name=""/>
+                    <pic:cNvPr id="180394524" name="Picture 180394524"/>
                     <pic:cNvPicPr/>
                   </pic:nvPicPr>
                   <pic:blipFill>
-                    <a:blip r:embed="rId4"/>
+                    <a:blip xmlns:r="http://schemas.openxmlformats.org/officeDocument/2006/relationships" r:embed="rId774365370">
+                      <a:extLst>
+                        <a:ext uri="{28A0092B-C50C-407E-A947-70E740481C1C}">
+                          <a14:useLocalDpi xmlns:a14="http://schemas.microsoft.com/office/drawing/2010/main"/>
+                        </a:ext>
+                      </a:extLst>
+                    </a:blip>
                     <a:stretch>
                       <a:fillRect/>
                     </a:stretch>
                   </pic:blipFill>
                   <pic:spPr>
-                    <a:xfrm>
+                    <a:xfrm rot="0">
                       <a:off x="0" y="0"/>
-                      <a:ext cx="1174828" cy="7816102"/>
+                      <a:ext cx="5574190" cy="3600000"/>
                     </a:xfrm>
                     <a:prstGeom prst="rect">
                       <a:avLst/>
@@ -863,13 +1063,489 @@
           </wp:inline>
         </w:drawing>
       </w:r>
+      <w:r>
+        <w:drawing>
+          <wp:inline wp14:editId="14F6D532" wp14:anchorId="10DC6965">
+            <wp:extent cx="5574190" cy="3600000"/>
+            <wp:effectExtent l="0" t="0" r="0" b="0"/>
+            <wp:docPr id="245082052" name="drawing"/>
+            <wp:cNvGraphicFramePr>
+              <a:graphicFrameLocks noChangeAspect="1"/>
+            </wp:cNvGraphicFramePr>
+            <a:graphic>
+              <a:graphicData xmlns:a="http://schemas.openxmlformats.org/drawingml/2006/main" uri="http://schemas.openxmlformats.org/drawingml/2006/picture">
+                <pic:pic xmlns:pic="http://schemas.openxmlformats.org/drawingml/2006/picture">
+                  <pic:nvPicPr>
+                    <pic:cNvPr id="245082052" name="Picture 245082052"/>
+                    <pic:cNvPicPr/>
+                  </pic:nvPicPr>
+                  <pic:blipFill>
+                    <a:blip xmlns:r="http://schemas.openxmlformats.org/officeDocument/2006/relationships" r:embed="rId1894570639">
+                      <a:extLst>
+                        <a:ext uri="{28A0092B-C50C-407E-A947-70E740481C1C}">
+                          <a14:useLocalDpi xmlns:a14="http://schemas.microsoft.com/office/drawing/2010/main"/>
+                        </a:ext>
+                      </a:extLst>
+                    </a:blip>
+                    <a:stretch>
+                      <a:fillRect/>
+                    </a:stretch>
+                  </pic:blipFill>
+                  <pic:spPr>
+                    <a:xfrm rot="0">
+                      <a:off x="0" y="0"/>
+                      <a:ext cx="5574190" cy="3600000"/>
+                    </a:xfrm>
+                    <a:prstGeom prst="rect">
+                      <a:avLst/>
+                    </a:prstGeom>
+                  </pic:spPr>
+                </pic:pic>
+              </a:graphicData>
+            </a:graphic>
+          </wp:inline>
+        </w:drawing>
+      </w:r>
+    </w:p>
+    <w:p>
+      <w:pPr>
+        <w:pStyle w:val="EventraParrafos"/>
+      </w:pPr>
+    </w:p>
+    <w:p>
+      <w:pPr>
+        <w:pStyle w:val="EventraParrafos"/>
+      </w:pPr>
     </w:p>
     <w:p>
       <w:pPr>
         <w:pStyle w:val="EventraTitle3"/>
       </w:pPr>
       <w:r>
-        <w:lastRenderedPageBreak/>
+        <w:drawing>
+          <wp:inline wp14:editId="4606AB10" wp14:anchorId="06B7ADD7">
+            <wp:extent cx="5452430" cy="3600000"/>
+            <wp:effectExtent l="0" t="0" r="0" b="0"/>
+            <wp:docPr id="2031931525" name="drawing"/>
+            <wp:cNvGraphicFramePr>
+              <a:graphicFrameLocks noChangeAspect="1"/>
+            </wp:cNvGraphicFramePr>
+            <a:graphic>
+              <a:graphicData xmlns:a="http://schemas.openxmlformats.org/drawingml/2006/main" uri="http://schemas.openxmlformats.org/drawingml/2006/picture">
+                <pic:pic xmlns:pic="http://schemas.openxmlformats.org/drawingml/2006/picture">
+                  <pic:nvPicPr>
+                    <pic:cNvPr id="2031931525" name="Picture 2031931525"/>
+                    <pic:cNvPicPr/>
+                  </pic:nvPicPr>
+                  <pic:blipFill>
+                    <a:blip xmlns:r="http://schemas.openxmlformats.org/officeDocument/2006/relationships" r:embed="rId2014392601">
+                      <a:extLst>
+                        <a:ext uri="{28A0092B-C50C-407E-A947-70E740481C1C}">
+                          <a14:useLocalDpi xmlns:a14="http://schemas.microsoft.com/office/drawing/2010/main"/>
+                        </a:ext>
+                      </a:extLst>
+                    </a:blip>
+                    <a:stretch>
+                      <a:fillRect/>
+                    </a:stretch>
+                  </pic:blipFill>
+                  <pic:spPr>
+                    <a:xfrm rot="0">
+                      <a:off x="0" y="0"/>
+                      <a:ext cx="5452430" cy="3600000"/>
+                    </a:xfrm>
+                    <a:prstGeom prst="rect">
+                      <a:avLst/>
+                    </a:prstGeom>
+                  </pic:spPr>
+                </pic:pic>
+              </a:graphicData>
+            </a:graphic>
+          </wp:inline>
+        </w:drawing>
+      </w:r>
+    </w:p>
+    <w:p>
+      <w:pPr>
+        <w:pStyle w:val="EventraTitle3"/>
+      </w:pPr>
+      <w:r>
+        <w:drawing>
+          <wp:inline wp14:editId="2D1BA318" wp14:anchorId="52A463BA">
+            <wp:extent cx="5465690" cy="3600000"/>
+            <wp:effectExtent l="0" t="0" r="0" b="0"/>
+            <wp:docPr id="1521056087" name="drawing"/>
+            <wp:cNvGraphicFramePr>
+              <a:graphicFrameLocks noChangeAspect="1"/>
+            </wp:cNvGraphicFramePr>
+            <a:graphic>
+              <a:graphicData xmlns:a="http://schemas.openxmlformats.org/drawingml/2006/main" uri="http://schemas.openxmlformats.org/drawingml/2006/picture">
+                <pic:pic xmlns:pic="http://schemas.openxmlformats.org/drawingml/2006/picture">
+                  <pic:nvPicPr>
+                    <pic:cNvPr id="1521056087" name="Picture 1521056087"/>
+                    <pic:cNvPicPr/>
+                  </pic:nvPicPr>
+                  <pic:blipFill>
+                    <a:blip xmlns:r="http://schemas.openxmlformats.org/officeDocument/2006/relationships" r:embed="rId1348181396">
+                      <a:extLst>
+                        <a:ext uri="{28A0092B-C50C-407E-A947-70E740481C1C}">
+                          <a14:useLocalDpi xmlns:a14="http://schemas.microsoft.com/office/drawing/2010/main"/>
+                        </a:ext>
+                      </a:extLst>
+                    </a:blip>
+                    <a:stretch>
+                      <a:fillRect/>
+                    </a:stretch>
+                  </pic:blipFill>
+                  <pic:spPr>
+                    <a:xfrm rot="0">
+                      <a:off x="0" y="0"/>
+                      <a:ext cx="5465690" cy="3600000"/>
+                    </a:xfrm>
+                    <a:prstGeom prst="rect">
+                      <a:avLst/>
+                    </a:prstGeom>
+                  </pic:spPr>
+                </pic:pic>
+              </a:graphicData>
+            </a:graphic>
+          </wp:inline>
+        </w:drawing>
+      </w:r>
+    </w:p>
+    <w:p>
+      <w:pPr>
+        <w:pStyle w:val="EventraTitle3"/>
+      </w:pPr>
+    </w:p>
+    <w:p>
+      <w:pPr>
+        <w:pStyle w:val="EventraTitle3"/>
+      </w:pPr>
+    </w:p>
+    <w:p>
+      <w:pPr>
+        <w:pStyle w:val="EventraTitle3"/>
+      </w:pPr>
+      <w:r>
+        <w:drawing>
+          <wp:inline wp14:editId="526EFD14" wp14:anchorId="73730961">
+            <wp:extent cx="5400000" cy="3600000"/>
+            <wp:effectExtent l="0" t="0" r="0" b="0"/>
+            <wp:docPr id="936081022" name="drawing"/>
+            <wp:cNvGraphicFramePr>
+              <a:graphicFrameLocks noChangeAspect="1"/>
+            </wp:cNvGraphicFramePr>
+            <a:graphic>
+              <a:graphicData xmlns:a="http://schemas.openxmlformats.org/drawingml/2006/main" uri="http://schemas.openxmlformats.org/drawingml/2006/picture">
+                <pic:pic xmlns:pic="http://schemas.openxmlformats.org/drawingml/2006/picture">
+                  <pic:nvPicPr>
+                    <pic:cNvPr id="936081022" name="Picture 936081022"/>
+                    <pic:cNvPicPr/>
+                  </pic:nvPicPr>
+                  <pic:blipFill>
+                    <a:blip xmlns:r="http://schemas.openxmlformats.org/officeDocument/2006/relationships" r:embed="rId1429790087">
+                      <a:extLst>
+                        <a:ext uri="{28A0092B-C50C-407E-A947-70E740481C1C}">
+                          <a14:useLocalDpi xmlns:a14="http://schemas.microsoft.com/office/drawing/2010/main"/>
+                        </a:ext>
+                      </a:extLst>
+                    </a:blip>
+                    <a:stretch>
+                      <a:fillRect/>
+                    </a:stretch>
+                  </pic:blipFill>
+                  <pic:spPr>
+                    <a:xfrm rot="0">
+                      <a:off x="0" y="0"/>
+                      <a:ext cx="5400000" cy="3600000"/>
+                    </a:xfrm>
+                    <a:prstGeom prst="rect">
+                      <a:avLst/>
+                    </a:prstGeom>
+                  </pic:spPr>
+                </pic:pic>
+              </a:graphicData>
+            </a:graphic>
+          </wp:inline>
+        </w:drawing>
+      </w:r>
+    </w:p>
+    <w:p>
+      <w:pPr>
+        <w:pStyle w:val="EventraTitle3"/>
+      </w:pPr>
+      <w:r>
+        <w:drawing>
+          <wp:inline wp14:editId="3F368064" wp14:anchorId="35F9B591">
+            <wp:extent cx="5533000" cy="3600000"/>
+            <wp:effectExtent l="0" t="0" r="0" b="0"/>
+            <wp:docPr id="1532383567" name="drawing"/>
+            <wp:cNvGraphicFramePr>
+              <a:graphicFrameLocks noChangeAspect="1"/>
+            </wp:cNvGraphicFramePr>
+            <a:graphic>
+              <a:graphicData xmlns:a="http://schemas.openxmlformats.org/drawingml/2006/main" uri="http://schemas.openxmlformats.org/drawingml/2006/picture">
+                <pic:pic xmlns:pic="http://schemas.openxmlformats.org/drawingml/2006/picture">
+                  <pic:nvPicPr>
+                    <pic:cNvPr id="1532383567" name="Picture 1532383567"/>
+                    <pic:cNvPicPr/>
+                  </pic:nvPicPr>
+                  <pic:blipFill>
+                    <a:blip xmlns:r="http://schemas.openxmlformats.org/officeDocument/2006/relationships" r:embed="rId1510921377">
+                      <a:extLst>
+                        <a:ext uri="{28A0092B-C50C-407E-A947-70E740481C1C}">
+                          <a14:useLocalDpi xmlns:a14="http://schemas.microsoft.com/office/drawing/2010/main"/>
+                        </a:ext>
+                      </a:extLst>
+                    </a:blip>
+                    <a:stretch>
+                      <a:fillRect/>
+                    </a:stretch>
+                  </pic:blipFill>
+                  <pic:spPr>
+                    <a:xfrm rot="0">
+                      <a:off x="0" y="0"/>
+                      <a:ext cx="5533000" cy="3600000"/>
+                    </a:xfrm>
+                    <a:prstGeom prst="rect">
+                      <a:avLst/>
+                    </a:prstGeom>
+                  </pic:spPr>
+                </pic:pic>
+              </a:graphicData>
+            </a:graphic>
+          </wp:inline>
+        </w:drawing>
+      </w:r>
+    </w:p>
+    <w:p>
+      <w:pPr>
+        <w:pStyle w:val="EventraTitle3"/>
+      </w:pPr>
+    </w:p>
+    <w:p>
+      <w:pPr>
+        <w:pStyle w:val="EventraTitle3"/>
+      </w:pPr>
+    </w:p>
+    <w:p>
+      <w:pPr>
+        <w:pStyle w:val="EventraTitle3"/>
+      </w:pPr>
+      <w:r>
+        <w:drawing>
+          <wp:inline wp14:editId="5447353C" wp14:anchorId="4CF61A89">
+            <wp:extent cx="5479020" cy="3600000"/>
+            <wp:effectExtent l="0" t="0" r="0" b="0"/>
+            <wp:docPr id="857539117" name="drawing"/>
+            <wp:cNvGraphicFramePr>
+              <a:graphicFrameLocks noChangeAspect="1"/>
+            </wp:cNvGraphicFramePr>
+            <a:graphic>
+              <a:graphicData xmlns:a="http://schemas.openxmlformats.org/drawingml/2006/main" uri="http://schemas.openxmlformats.org/drawingml/2006/picture">
+                <pic:pic xmlns:pic="http://schemas.openxmlformats.org/drawingml/2006/picture">
+                  <pic:nvPicPr>
+                    <pic:cNvPr id="857539117" name="Picture 857539117"/>
+                    <pic:cNvPicPr/>
+                  </pic:nvPicPr>
+                  <pic:blipFill>
+                    <a:blip xmlns:r="http://schemas.openxmlformats.org/officeDocument/2006/relationships" r:embed="rId568336101">
+                      <a:extLst>
+                        <a:ext uri="{28A0092B-C50C-407E-A947-70E740481C1C}">
+                          <a14:useLocalDpi xmlns:a14="http://schemas.microsoft.com/office/drawing/2010/main"/>
+                        </a:ext>
+                      </a:extLst>
+                    </a:blip>
+                    <a:stretch>
+                      <a:fillRect/>
+                    </a:stretch>
+                  </pic:blipFill>
+                  <pic:spPr>
+                    <a:xfrm rot="0">
+                      <a:off x="0" y="0"/>
+                      <a:ext cx="5479020" cy="3600000"/>
+                    </a:xfrm>
+                    <a:prstGeom prst="rect">
+                      <a:avLst/>
+                    </a:prstGeom>
+                  </pic:spPr>
+                </pic:pic>
+              </a:graphicData>
+            </a:graphic>
+          </wp:inline>
+        </w:drawing>
+      </w:r>
+    </w:p>
+    <w:p>
+      <w:pPr>
+        <w:pStyle w:val="EventraTitle3"/>
+      </w:pPr>
+      <w:r>
+        <w:drawing>
+          <wp:inline wp14:editId="3BC08BA7" wp14:anchorId="57E351A2">
+            <wp:extent cx="5492420" cy="3600000"/>
+            <wp:effectExtent l="0" t="0" r="0" b="0"/>
+            <wp:docPr id="22731251" name="drawing"/>
+            <wp:cNvGraphicFramePr>
+              <a:graphicFrameLocks noChangeAspect="1"/>
+            </wp:cNvGraphicFramePr>
+            <a:graphic>
+              <a:graphicData xmlns:a="http://schemas.openxmlformats.org/drawingml/2006/main" uri="http://schemas.openxmlformats.org/drawingml/2006/picture">
+                <pic:pic xmlns:pic="http://schemas.openxmlformats.org/drawingml/2006/picture">
+                  <pic:nvPicPr>
+                    <pic:cNvPr id="22731251" name="Picture 22731251"/>
+                    <pic:cNvPicPr/>
+                  </pic:nvPicPr>
+                  <pic:blipFill>
+                    <a:blip xmlns:r="http://schemas.openxmlformats.org/officeDocument/2006/relationships" r:embed="rId1267661398">
+                      <a:extLst>
+                        <a:ext uri="{28A0092B-C50C-407E-A947-70E740481C1C}">
+                          <a14:useLocalDpi xmlns:a14="http://schemas.microsoft.com/office/drawing/2010/main"/>
+                        </a:ext>
+                      </a:extLst>
+                    </a:blip>
+                    <a:stretch>
+                      <a:fillRect/>
+                    </a:stretch>
+                  </pic:blipFill>
+                  <pic:spPr>
+                    <a:xfrm rot="0">
+                      <a:off x="0" y="0"/>
+                      <a:ext cx="5492420" cy="3600000"/>
+                    </a:xfrm>
+                    <a:prstGeom prst="rect">
+                      <a:avLst/>
+                    </a:prstGeom>
+                  </pic:spPr>
+                </pic:pic>
+              </a:graphicData>
+            </a:graphic>
+          </wp:inline>
+        </w:drawing>
+      </w:r>
+    </w:p>
+    <w:p>
+      <w:pPr>
+        <w:pStyle w:val="EventraTitle3"/>
+      </w:pPr>
+    </w:p>
+    <w:p>
+      <w:pPr>
+        <w:pStyle w:val="EventraTitle3"/>
+      </w:pPr>
+    </w:p>
+    <w:p>
+      <w:pPr>
+        <w:pStyle w:val="EventraTitle3"/>
+      </w:pPr>
+      <w:r>
+        <w:drawing>
+          <wp:inline wp14:editId="74FCA41B" wp14:anchorId="5F162F36">
+            <wp:extent cx="5374160" cy="3600000"/>
+            <wp:effectExtent l="0" t="0" r="0" b="0"/>
+            <wp:docPr id="407525688" name="drawing"/>
+            <wp:cNvGraphicFramePr>
+              <a:graphicFrameLocks noChangeAspect="1"/>
+            </wp:cNvGraphicFramePr>
+            <a:graphic>
+              <a:graphicData xmlns:a="http://schemas.openxmlformats.org/drawingml/2006/main" uri="http://schemas.openxmlformats.org/drawingml/2006/picture">
+                <pic:pic xmlns:pic="http://schemas.openxmlformats.org/drawingml/2006/picture">
+                  <pic:nvPicPr>
+                    <pic:cNvPr id="407525688" name="Picture 407525688"/>
+                    <pic:cNvPicPr/>
+                  </pic:nvPicPr>
+                  <pic:blipFill>
+                    <a:blip xmlns:r="http://schemas.openxmlformats.org/officeDocument/2006/relationships" r:embed="rId882303431">
+                      <a:extLst>
+                        <a:ext uri="{28A0092B-C50C-407E-A947-70E740481C1C}">
+                          <a14:useLocalDpi xmlns:a14="http://schemas.microsoft.com/office/drawing/2010/main"/>
+                        </a:ext>
+                      </a:extLst>
+                    </a:blip>
+                    <a:stretch>
+                      <a:fillRect/>
+                    </a:stretch>
+                  </pic:blipFill>
+                  <pic:spPr>
+                    <a:xfrm rot="0">
+                      <a:off x="0" y="0"/>
+                      <a:ext cx="5374160" cy="3600000"/>
+                    </a:xfrm>
+                    <a:prstGeom prst="rect">
+                      <a:avLst/>
+                    </a:prstGeom>
+                  </pic:spPr>
+                </pic:pic>
+              </a:graphicData>
+            </a:graphic>
+          </wp:inline>
+        </w:drawing>
+      </w:r>
+    </w:p>
+    <w:p>
+      <w:pPr>
+        <w:pStyle w:val="EventraTitle3"/>
+      </w:pPr>
+      <w:r>
+        <w:drawing>
+          <wp:inline wp14:editId="09EE3546" wp14:anchorId="0E0C1954">
+            <wp:extent cx="5426090" cy="3600000"/>
+            <wp:effectExtent l="0" t="0" r="0" b="0"/>
+            <wp:docPr id="727239824" name="drawing"/>
+            <wp:cNvGraphicFramePr>
+              <a:graphicFrameLocks noChangeAspect="1"/>
+            </wp:cNvGraphicFramePr>
+            <a:graphic>
+              <a:graphicData xmlns:a="http://schemas.openxmlformats.org/drawingml/2006/main" uri="http://schemas.openxmlformats.org/drawingml/2006/picture">
+                <pic:pic xmlns:pic="http://schemas.openxmlformats.org/drawingml/2006/picture">
+                  <pic:nvPicPr>
+                    <pic:cNvPr id="727239824" name="Picture 727239824"/>
+                    <pic:cNvPicPr/>
+                  </pic:nvPicPr>
+                  <pic:blipFill>
+                    <a:blip xmlns:r="http://schemas.openxmlformats.org/officeDocument/2006/relationships" r:embed="rId1857991936">
+                      <a:extLst>
+                        <a:ext uri="{28A0092B-C50C-407E-A947-70E740481C1C}">
+                          <a14:useLocalDpi xmlns:a14="http://schemas.microsoft.com/office/drawing/2010/main"/>
+                        </a:ext>
+                      </a:extLst>
+                    </a:blip>
+                    <a:stretch>
+                      <a:fillRect/>
+                    </a:stretch>
+                  </pic:blipFill>
+                  <pic:spPr>
+                    <a:xfrm rot="0">
+                      <a:off x="0" y="0"/>
+                      <a:ext cx="5426090" cy="3600000"/>
+                    </a:xfrm>
+                    <a:prstGeom prst="rect">
+                      <a:avLst/>
+                    </a:prstGeom>
+                  </pic:spPr>
+                </pic:pic>
+              </a:graphicData>
+            </a:graphic>
+          </wp:inline>
+        </w:drawing>
+      </w:r>
+    </w:p>
+    <w:p>
+      <w:pPr>
+        <w:pStyle w:val="EventraTitle3"/>
+      </w:pPr>
+    </w:p>
+    <w:p>
+      <w:pPr>
+        <w:pStyle w:val="EventraTitle3"/>
+      </w:pPr>
+    </w:p>
+    <w:p>
+      <w:pPr>
+        <w:pStyle w:val="EventraTitle3"/>
+      </w:pPr>
+      <w:r>
         <w:t>6. Conclusión</w:t>
       </w:r>
     </w:p>
@@ -903,7 +1579,7 @@
       </w:pPr>
     </w:p>
     <w:sectPr>
-      <w:pgSz w:w="12240" w:h="15840"/>
+      <w:pgSz w:w="12240" w:h="15840" w:orient="portrait"/>
       <w:pgMar w:top="1440" w:right="1440" w:bottom="1440" w:left="1440" w:header="720" w:footer="720" w:gutter="0"/>
       <w:cols w:space="720"/>
       <w:docGrid w:linePitch="360"/>
@@ -913,11 +1589,11 @@
 </file>
 
 <file path=word/styles.xml><?xml version="1.0" encoding="utf-8"?>
-<w:styles xmlns:mc="http://schemas.openxmlformats.org/markup-compatibility/2006" xmlns:r="http://schemas.openxmlformats.org/officeDocument/2006/relationships" xmlns:w="http://schemas.openxmlformats.org/wordprocessingml/2006/main" xmlns:w14="http://schemas.microsoft.com/office/word/2010/wordml" xmlns:w15="http://schemas.microsoft.com/office/word/2012/wordml" xmlns:w16cex="http://schemas.microsoft.com/office/word/2018/wordml/cex" xmlns:w16cid="http://schemas.microsoft.com/office/word/2016/wordml/cid" xmlns:w16="http://schemas.microsoft.com/office/word/2018/wordml" xmlns:w16du="http://schemas.microsoft.com/office/word/2023/wordml/word16du" xmlns:w16sdtdh="http://schemas.microsoft.com/office/word/2020/wordml/sdtdatahash" xmlns:w16sdtfl="http://schemas.microsoft.com/office/word/2024/wordml/sdtformatlock" xmlns:w16se="http://schemas.microsoft.com/office/word/2015/wordml/symex" mc:Ignorable="w14 w15 w16se w16cid w16 w16cex w16sdtdh w16sdtfl w16du">
+<w:styles xmlns:wp14="http://schemas.microsoft.com/office/word/2010/wordprocessingDrawing" xmlns:mc="http://schemas.openxmlformats.org/markup-compatibility/2006" xmlns:r="http://schemas.openxmlformats.org/officeDocument/2006/relationships" xmlns:w="http://schemas.openxmlformats.org/wordprocessingml/2006/main" xmlns:w14="http://schemas.microsoft.com/office/word/2010/wordml" xmlns:w15="http://schemas.microsoft.com/office/word/2012/wordml" xmlns:w16cex="http://schemas.microsoft.com/office/word/2018/wordml/cex" xmlns:w16cid="http://schemas.microsoft.com/office/word/2016/wordml/cid" xmlns:w16="http://schemas.microsoft.com/office/word/2018/wordml" xmlns:w16du="http://schemas.microsoft.com/office/word/2023/wordml/word16du" xmlns:w16sdtdh="http://schemas.microsoft.com/office/word/2020/wordml/sdtdatahash" xmlns:w16sdtfl="http://schemas.microsoft.com/office/word/2024/wordml/sdtformatlock" xmlns:w16se="http://schemas.microsoft.com/office/word/2015/wordml/symex" mc:Ignorable="w14 w15 w16se w16cid w16 w16cex w16sdtdh w16sdtfl w16du wp14">
   <w:docDefaults>
     <w:rPrDefault>
       <w:rPr>
-        <w:rFonts w:asciiTheme="minorHAnsi" w:eastAsiaTheme="minorHAnsi" w:hAnsiTheme="minorHAnsi" w:cstheme="minorBidi"/>
+        <w:rFonts w:asciiTheme="minorHAnsi" w:hAnsiTheme="minorHAnsi" w:eastAsiaTheme="minorHAnsi" w:cstheme="minorBidi"/>
         <w:kern w:val="2"/>
         <w:sz w:val="24"/>
         <w:szCs w:val="24"/>
@@ -934,14 +1610,14 @@
   <w:latentStyles w:defLockedState="0" w:defUIPriority="99" w:defSemiHidden="0" w:defUnhideWhenUsed="0" w:defQFormat="0" w:count="376">
     <w:lsdException w:name="Normal" w:uiPriority="0" w:qFormat="1"/>
     <w:lsdException w:name="heading 1" w:uiPriority="9" w:qFormat="1"/>
-    <w:lsdException w:name="heading 2" w:semiHidden="1" w:uiPriority="9" w:unhideWhenUsed="1" w:qFormat="1"/>
-    <w:lsdException w:name="heading 3" w:semiHidden="1" w:uiPriority="9" w:unhideWhenUsed="1" w:qFormat="1"/>
-    <w:lsdException w:name="heading 4" w:semiHidden="1" w:uiPriority="9" w:unhideWhenUsed="1" w:qFormat="1"/>
-    <w:lsdException w:name="heading 5" w:semiHidden="1" w:uiPriority="9" w:unhideWhenUsed="1" w:qFormat="1"/>
-    <w:lsdException w:name="heading 6" w:semiHidden="1" w:uiPriority="9" w:unhideWhenUsed="1" w:qFormat="1"/>
-    <w:lsdException w:name="heading 7" w:semiHidden="1" w:uiPriority="9" w:unhideWhenUsed="1" w:qFormat="1"/>
-    <w:lsdException w:name="heading 8" w:semiHidden="1" w:uiPriority="9" w:unhideWhenUsed="1" w:qFormat="1"/>
-    <w:lsdException w:name="heading 9" w:semiHidden="1" w:uiPriority="9" w:unhideWhenUsed="1" w:qFormat="1"/>
+    <w:lsdException w:name="heading 2" w:uiPriority="9" w:semiHidden="1" w:unhideWhenUsed="1" w:qFormat="1"/>
+    <w:lsdException w:name="heading 3" w:uiPriority="9" w:semiHidden="1" w:unhideWhenUsed="1" w:qFormat="1"/>
+    <w:lsdException w:name="heading 4" w:uiPriority="9" w:semiHidden="1" w:unhideWhenUsed="1" w:qFormat="1"/>
+    <w:lsdException w:name="heading 5" w:uiPriority="9" w:semiHidden="1" w:unhideWhenUsed="1" w:qFormat="1"/>
+    <w:lsdException w:name="heading 6" w:uiPriority="9" w:semiHidden="1" w:unhideWhenUsed="1" w:qFormat="1"/>
+    <w:lsdException w:name="heading 7" w:uiPriority="9" w:semiHidden="1" w:unhideWhenUsed="1" w:qFormat="1"/>
+    <w:lsdException w:name="heading 8" w:uiPriority="9" w:semiHidden="1" w:unhideWhenUsed="1" w:qFormat="1"/>
+    <w:lsdException w:name="heading 9" w:uiPriority="9" w:semiHidden="1" w:unhideWhenUsed="1" w:qFormat="1"/>
     <w:lsdException w:name="index 1" w:semiHidden="1" w:unhideWhenUsed="1"/>
     <w:lsdException w:name="index 2" w:semiHidden="1" w:unhideWhenUsed="1"/>
     <w:lsdException w:name="index 3" w:semiHidden="1" w:unhideWhenUsed="1"/>
@@ -951,22 +1627,22 @@
     <w:lsdException w:name="index 7" w:semiHidden="1" w:unhideWhenUsed="1"/>
     <w:lsdException w:name="index 8" w:semiHidden="1" w:unhideWhenUsed="1"/>
     <w:lsdException w:name="index 9" w:semiHidden="1" w:unhideWhenUsed="1"/>
-    <w:lsdException w:name="toc 1" w:semiHidden="1" w:uiPriority="39" w:unhideWhenUsed="1"/>
-    <w:lsdException w:name="toc 2" w:semiHidden="1" w:uiPriority="39" w:unhideWhenUsed="1"/>
-    <w:lsdException w:name="toc 3" w:semiHidden="1" w:uiPriority="39" w:unhideWhenUsed="1"/>
-    <w:lsdException w:name="toc 4" w:semiHidden="1" w:uiPriority="39" w:unhideWhenUsed="1"/>
-    <w:lsdException w:name="toc 5" w:semiHidden="1" w:uiPriority="39" w:unhideWhenUsed="1"/>
-    <w:lsdException w:name="toc 6" w:semiHidden="1" w:uiPriority="39" w:unhideWhenUsed="1"/>
-    <w:lsdException w:name="toc 7" w:semiHidden="1" w:uiPriority="39" w:unhideWhenUsed="1"/>
-    <w:lsdException w:name="toc 8" w:semiHidden="1" w:uiPriority="39" w:unhideWhenUsed="1"/>
-    <w:lsdException w:name="toc 9" w:semiHidden="1" w:uiPriority="39" w:unhideWhenUsed="1"/>
+    <w:lsdException w:name="toc 1" w:uiPriority="39" w:semiHidden="1" w:unhideWhenUsed="1"/>
+    <w:lsdException w:name="toc 2" w:uiPriority="39" w:semiHidden="1" w:unhideWhenUsed="1"/>
+    <w:lsdException w:name="toc 3" w:uiPriority="39" w:semiHidden="1" w:unhideWhenUsed="1"/>
+    <w:lsdException w:name="toc 4" w:uiPriority="39" w:semiHidden="1" w:unhideWhenUsed="1"/>
+    <w:lsdException w:name="toc 5" w:uiPriority="39" w:semiHidden="1" w:unhideWhenUsed="1"/>
+    <w:lsdException w:name="toc 6" w:uiPriority="39" w:semiHidden="1" w:unhideWhenUsed="1"/>
+    <w:lsdException w:name="toc 7" w:uiPriority="39" w:semiHidden="1" w:unhideWhenUsed="1"/>
+    <w:lsdException w:name="toc 8" w:uiPriority="39" w:semiHidden="1" w:unhideWhenUsed="1"/>
+    <w:lsdException w:name="toc 9" w:uiPriority="39" w:semiHidden="1" w:unhideWhenUsed="1"/>
     <w:lsdException w:name="Normal Indent" w:semiHidden="1" w:unhideWhenUsed="1"/>
     <w:lsdException w:name="footnote text" w:semiHidden="1" w:unhideWhenUsed="1"/>
     <w:lsdException w:name="annotation text" w:semiHidden="1" w:unhideWhenUsed="1"/>
     <w:lsdException w:name="header" w:semiHidden="1" w:unhideWhenUsed="1"/>
     <w:lsdException w:name="footer" w:semiHidden="1" w:unhideWhenUsed="1"/>
     <w:lsdException w:name="index heading" w:semiHidden="1" w:unhideWhenUsed="1"/>
-    <w:lsdException w:name="caption" w:semiHidden="1" w:uiPriority="35" w:unhideWhenUsed="1" w:qFormat="1"/>
+    <w:lsdException w:name="caption" w:uiPriority="35" w:semiHidden="1" w:unhideWhenUsed="1" w:qFormat="1"/>
     <w:lsdException w:name="table of figures" w:semiHidden="1" w:unhideWhenUsed="1"/>
     <w:lsdException w:name="envelope address" w:semiHidden="1" w:unhideWhenUsed="1"/>
     <w:lsdException w:name="envelope return" w:semiHidden="1" w:unhideWhenUsed="1"/>
@@ -997,7 +1673,7 @@
     <w:lsdException w:name="Title" w:uiPriority="10" w:qFormat="1"/>
     <w:lsdException w:name="Closing" w:semiHidden="1" w:unhideWhenUsed="1"/>
     <w:lsdException w:name="Signature" w:semiHidden="1" w:unhideWhenUsed="1"/>
-    <w:lsdException w:name="Default Paragraph Font" w:semiHidden="1" w:uiPriority="1" w:unhideWhenUsed="1"/>
+    <w:lsdException w:name="Default Paragraph Font" w:uiPriority="1" w:semiHidden="1" w:unhideWhenUsed="1"/>
     <w:lsdException w:name="Body Text" w:semiHidden="1" w:unhideWhenUsed="1"/>
     <w:lsdException w:name="Body Text Indent" w:semiHidden="1" w:unhideWhenUsed="1"/>
     <w:lsdException w:name="List Continue" w:semiHidden="1" w:unhideWhenUsed="1"/>
@@ -1197,8 +1873,8 @@
     <w:lsdException w:name="Subtle Reference" w:uiPriority="31" w:qFormat="1"/>
     <w:lsdException w:name="Intense Reference" w:uiPriority="32" w:qFormat="1"/>
     <w:lsdException w:name="Book Title" w:uiPriority="33" w:qFormat="1"/>
-    <w:lsdException w:name="Bibliography" w:semiHidden="1" w:uiPriority="37" w:unhideWhenUsed="1"/>
-    <w:lsdException w:name="TOC Heading" w:semiHidden="1" w:uiPriority="39" w:unhideWhenUsed="1" w:qFormat="1"/>
+    <w:lsdException w:name="Bibliography" w:uiPriority="37" w:semiHidden="1" w:unhideWhenUsed="1"/>
+    <w:lsdException w:name="TOC Heading" w:uiPriority="39" w:semiHidden="1" w:unhideWhenUsed="1" w:qFormat="1"/>
     <w:lsdException w:name="Plain Table 1" w:uiPriority="41"/>
     <w:lsdException w:name="Plain Table 2" w:uiPriority="42"/>
     <w:lsdException w:name="Plain Table 3" w:uiPriority="43"/>
@@ -1309,7 +1985,7 @@
     <w:lsdException w:name="Unresolved Mention" w:semiHidden="1" w:unhideWhenUsed="1"/>
     <w:lsdException w:name="Smart Link" w:semiHidden="1" w:unhideWhenUsed="1"/>
   </w:latentStyles>
-  <w:style w:type="paragraph" w:default="1" w:styleId="Normal">
+  <w:style w:type="paragraph" w:styleId="Normal" w:default="1">
     <w:name w:val="Normal"/>
     <w:qFormat/>
   </w:style>
@@ -1328,7 +2004,7 @@
       <w:outlineLvl w:val="0"/>
     </w:pPr>
     <w:rPr>
-      <w:rFonts w:asciiTheme="majorHAnsi" w:eastAsiaTheme="majorEastAsia" w:hAnsiTheme="majorHAnsi" w:cstheme="majorBidi"/>
+      <w:rFonts w:asciiTheme="majorHAnsi" w:hAnsiTheme="majorHAnsi" w:eastAsiaTheme="majorEastAsia" w:cstheme="majorBidi"/>
       <w:color w:val="365F91" w:themeColor="accent1" w:themeShade="BF"/>
       <w:sz w:val="40"/>
       <w:szCs w:val="40"/>
@@ -1351,7 +2027,7 @@
       <w:outlineLvl w:val="1"/>
     </w:pPr>
     <w:rPr>
-      <w:rFonts w:asciiTheme="majorHAnsi" w:eastAsiaTheme="majorEastAsia" w:hAnsiTheme="majorHAnsi" w:cstheme="majorBidi"/>
+      <w:rFonts w:asciiTheme="majorHAnsi" w:hAnsiTheme="majorHAnsi" w:eastAsiaTheme="majorEastAsia" w:cstheme="majorBidi"/>
       <w:color w:val="365F91" w:themeColor="accent1" w:themeShade="BF"/>
       <w:sz w:val="32"/>
       <w:szCs w:val="32"/>
@@ -1512,12 +2188,12 @@
       <w:color w:val="272727" w:themeColor="text1" w:themeTint="D8"/>
     </w:rPr>
   </w:style>
-  <w:style w:type="character" w:default="1" w:styleId="Fuentedeprrafopredeter">
+  <w:style w:type="character" w:styleId="Fuentedeprrafopredeter" w:default="1">
     <w:name w:val="Default Paragraph Font"/>
     <w:uiPriority w:val="1"/>
     <w:unhideWhenUsed/>
   </w:style>
-  <w:style w:type="table" w:default="1" w:styleId="Tablanormal">
+  <w:style w:type="table" w:styleId="Tablanormal" w:default="1">
     <w:name w:val="Normal Table"/>
     <w:uiPriority w:val="99"/>
     <w:semiHidden/>
@@ -1532,13 +2208,13 @@
       </w:tblCellMar>
     </w:tblPr>
   </w:style>
-  <w:style w:type="numbering" w:default="1" w:styleId="Sinlista">
+  <w:style w:type="numbering" w:styleId="Sinlista" w:default="1">
     <w:name w:val="No List"/>
     <w:uiPriority w:val="99"/>
     <w:semiHidden/>
     <w:unhideWhenUsed/>
   </w:style>
-  <w:style w:type="paragraph" w:customStyle="1" w:styleId="EventraTitle1">
+  <w:style w:type="paragraph" w:styleId="EventraTitle1" w:customStyle="1">
     <w:name w:val="Eventra Title 1"/>
     <w:basedOn w:val="Ttulo1"/>
     <w:next w:val="Normal"/>
@@ -1554,13 +2230,13 @@
       <w:lang w:val="es-CO"/>
     </w:rPr>
   </w:style>
-  <w:style w:type="character" w:customStyle="1" w:styleId="EventraTitle1Car">
+  <w:style w:type="character" w:styleId="EventraTitle1Car" w:customStyle="1">
     <w:name w:val="Eventra Title 1 Car"/>
     <w:basedOn w:val="Ttulo1Car"/>
     <w:link w:val="EventraTitle1"/>
     <w:rsid w:val="00EF1D75"/>
     <w:rPr>
-      <w:rFonts w:ascii="Times New Roman" w:eastAsiaTheme="majorEastAsia" w:hAnsi="Times New Roman" w:cstheme="majorBidi"/>
+      <w:rFonts w:ascii="Times New Roman" w:hAnsi="Times New Roman" w:eastAsiaTheme="majorEastAsia" w:cstheme="majorBidi"/>
       <w:b/>
       <w:bCs/>
       <w:color w:val="C00000" w:themeColor="accent2"/>
@@ -1569,20 +2245,20 @@
       <w:lang w:val="es-CO"/>
     </w:rPr>
   </w:style>
-  <w:style w:type="character" w:customStyle="1" w:styleId="Ttulo1Car">
+  <w:style w:type="character" w:styleId="Ttulo1Car" w:customStyle="1">
     <w:name w:val="Título 1 Car"/>
     <w:basedOn w:val="Fuentedeprrafopredeter"/>
     <w:link w:val="Ttulo1"/>
     <w:uiPriority w:val="9"/>
     <w:rsid w:val="00EF1D75"/>
     <w:rPr>
-      <w:rFonts w:asciiTheme="majorHAnsi" w:eastAsiaTheme="majorEastAsia" w:hAnsiTheme="majorHAnsi" w:cstheme="majorBidi"/>
+      <w:rFonts w:asciiTheme="majorHAnsi" w:hAnsiTheme="majorHAnsi" w:eastAsiaTheme="majorEastAsia" w:cstheme="majorBidi"/>
       <w:color w:val="365F91" w:themeColor="accent1" w:themeShade="BF"/>
       <w:sz w:val="40"/>
       <w:szCs w:val="40"/>
     </w:rPr>
   </w:style>
-  <w:style w:type="paragraph" w:customStyle="1" w:styleId="EventraParrafos">
+  <w:style w:type="paragraph" w:styleId="EventraParrafos" w:customStyle="1">
     <w:name w:val="Eventra Parrafos"/>
     <w:basedOn w:val="Normal"/>
     <w:link w:val="EventraParrafosCar"/>
@@ -1593,7 +2269,7 @@
       <w:lang w:val="es-CO"/>
     </w:rPr>
   </w:style>
-  <w:style w:type="character" w:customStyle="1" w:styleId="EventraParrafosCar">
+  <w:style w:type="character" w:styleId="EventraParrafosCar" w:customStyle="1">
     <w:name w:val="Eventra Parrafos Car"/>
     <w:basedOn w:val="Fuentedeprrafopredeter"/>
     <w:link w:val="EventraParrafos"/>
@@ -1603,7 +2279,7 @@
       <w:lang w:val="es-CO"/>
     </w:rPr>
   </w:style>
-  <w:style w:type="paragraph" w:customStyle="1" w:styleId="EventraTitle2">
+  <w:style w:type="paragraph" w:styleId="EventraTitle2" w:customStyle="1">
     <w:name w:val="Eventra Title 2"/>
     <w:basedOn w:val="Ttulo2"/>
     <w:link w:val="EventraTitle2Car"/>
@@ -1617,13 +2293,13 @@
       <w:lang w:val="es-CO"/>
     </w:rPr>
   </w:style>
-  <w:style w:type="character" w:customStyle="1" w:styleId="EventraTitle2Car">
+  <w:style w:type="character" w:styleId="EventraTitle2Car" w:customStyle="1">
     <w:name w:val="Eventra Title 2 Car"/>
     <w:basedOn w:val="Ttulo2Car"/>
     <w:link w:val="EventraTitle2"/>
     <w:rsid w:val="00EF1D75"/>
     <w:rPr>
-      <w:rFonts w:ascii="Times New Roman" w:eastAsiaTheme="majorEastAsia" w:hAnsi="Times New Roman" w:cstheme="majorBidi"/>
+      <w:rFonts w:ascii="Times New Roman" w:hAnsi="Times New Roman" w:eastAsiaTheme="majorEastAsia" w:cstheme="majorBidi"/>
       <w:b/>
       <w:bCs/>
       <w:color w:val="C00000" w:themeColor="accent2"/>
@@ -1632,7 +2308,7 @@
       <w:lang w:val="es-CO"/>
     </w:rPr>
   </w:style>
-  <w:style w:type="character" w:customStyle="1" w:styleId="Ttulo2Car">
+  <w:style w:type="character" w:styleId="Ttulo2Car" w:customStyle="1">
     <w:name w:val="Título 2 Car"/>
     <w:basedOn w:val="Fuentedeprrafopredeter"/>
     <w:link w:val="Ttulo2"/>
@@ -1640,13 +2316,13 @@
     <w:semiHidden/>
     <w:rsid w:val="00EF1D75"/>
     <w:rPr>
-      <w:rFonts w:asciiTheme="majorHAnsi" w:eastAsiaTheme="majorEastAsia" w:hAnsiTheme="majorHAnsi" w:cstheme="majorBidi"/>
+      <w:rFonts w:asciiTheme="majorHAnsi" w:hAnsiTheme="majorHAnsi" w:eastAsiaTheme="majorEastAsia" w:cstheme="majorBidi"/>
       <w:color w:val="365F91" w:themeColor="accent1" w:themeShade="BF"/>
       <w:sz w:val="32"/>
       <w:szCs w:val="32"/>
     </w:rPr>
   </w:style>
-  <w:style w:type="paragraph" w:customStyle="1" w:styleId="EventraTitle3">
+  <w:style w:type="paragraph" w:styleId="EventraTitle3" w:customStyle="1">
     <w:name w:val="Eventra Title 3"/>
     <w:basedOn w:val="Ttulo3"/>
     <w:link w:val="EventraTitle3Car"/>
@@ -1660,13 +2336,13 @@
       <w:lang w:val="es-CO"/>
     </w:rPr>
   </w:style>
-  <w:style w:type="character" w:customStyle="1" w:styleId="EventraTitle3Car">
+  <w:style w:type="character" w:styleId="EventraTitle3Car" w:customStyle="1">
     <w:name w:val="Eventra Title 3 Car"/>
     <w:basedOn w:val="Ttulo3Car"/>
     <w:link w:val="EventraTitle3"/>
     <w:rsid w:val="00EF1D75"/>
     <w:rPr>
-      <w:rFonts w:ascii="Times New Roman" w:eastAsiaTheme="majorEastAsia" w:hAnsi="Times New Roman" w:cstheme="majorBidi"/>
+      <w:rFonts w:ascii="Times New Roman" w:hAnsi="Times New Roman" w:eastAsiaTheme="majorEastAsia" w:cstheme="majorBidi"/>
       <w:b/>
       <w:bCs/>
       <w:color w:val="C00000" w:themeColor="accent2"/>
@@ -1675,7 +2351,7 @@
       <w:lang w:val="es-CO"/>
     </w:rPr>
   </w:style>
-  <w:style w:type="character" w:customStyle="1" w:styleId="Ttulo3Car">
+  <w:style w:type="character" w:styleId="Ttulo3Car" w:customStyle="1">
     <w:name w:val="Título 3 Car"/>
     <w:basedOn w:val="Fuentedeprrafopredeter"/>
     <w:link w:val="Ttulo3"/>
@@ -1689,7 +2365,7 @@
       <w:szCs w:val="28"/>
     </w:rPr>
   </w:style>
-  <w:style w:type="character" w:customStyle="1" w:styleId="Ttulo4Car">
+  <w:style w:type="character" w:styleId="Ttulo4Car" w:customStyle="1">
     <w:name w:val="Título 4 Car"/>
     <w:basedOn w:val="Fuentedeprrafopredeter"/>
     <w:link w:val="Ttulo4"/>
@@ -1703,7 +2379,7 @@
       <w:color w:val="365F91" w:themeColor="accent1" w:themeShade="BF"/>
     </w:rPr>
   </w:style>
-  <w:style w:type="character" w:customStyle="1" w:styleId="Ttulo5Car">
+  <w:style w:type="character" w:styleId="Ttulo5Car" w:customStyle="1">
     <w:name w:val="Título 5 Car"/>
     <w:basedOn w:val="Fuentedeprrafopredeter"/>
     <w:link w:val="Ttulo5"/>
@@ -1715,7 +2391,7 @@
       <w:color w:val="365F91" w:themeColor="accent1" w:themeShade="BF"/>
     </w:rPr>
   </w:style>
-  <w:style w:type="character" w:customStyle="1" w:styleId="Ttulo6Car">
+  <w:style w:type="character" w:styleId="Ttulo6Car" w:customStyle="1">
     <w:name w:val="Título 6 Car"/>
     <w:basedOn w:val="Fuentedeprrafopredeter"/>
     <w:link w:val="Ttulo6"/>
@@ -1729,7 +2405,7 @@
       <w:color w:val="595959" w:themeColor="text1" w:themeTint="A6"/>
     </w:rPr>
   </w:style>
-  <w:style w:type="character" w:customStyle="1" w:styleId="Ttulo7Car">
+  <w:style w:type="character" w:styleId="Ttulo7Car" w:customStyle="1">
     <w:name w:val="Título 7 Car"/>
     <w:basedOn w:val="Fuentedeprrafopredeter"/>
     <w:link w:val="Ttulo7"/>
@@ -1741,7 +2417,7 @@
       <w:color w:val="595959" w:themeColor="text1" w:themeTint="A6"/>
     </w:rPr>
   </w:style>
-  <w:style w:type="character" w:customStyle="1" w:styleId="Ttulo8Car">
+  <w:style w:type="character" w:styleId="Ttulo8Car" w:customStyle="1">
     <w:name w:val="Título 8 Car"/>
     <w:basedOn w:val="Fuentedeprrafopredeter"/>
     <w:link w:val="Ttulo8"/>
@@ -1755,7 +2431,7 @@
       <w:color w:val="272727" w:themeColor="text1" w:themeTint="D8"/>
     </w:rPr>
   </w:style>
-  <w:style w:type="character" w:customStyle="1" w:styleId="Ttulo9Car">
+  <w:style w:type="character" w:styleId="Ttulo9Car" w:customStyle="1">
     <w:name w:val="Título 9 Car"/>
     <w:basedOn w:val="Fuentedeprrafopredeter"/>
     <w:link w:val="Ttulo9"/>
@@ -1780,21 +2456,21 @@
       <w:contextualSpacing/>
     </w:pPr>
     <w:rPr>
-      <w:rFonts w:asciiTheme="majorHAnsi" w:eastAsiaTheme="majorEastAsia" w:hAnsiTheme="majorHAnsi" w:cstheme="majorBidi"/>
+      <w:rFonts w:asciiTheme="majorHAnsi" w:hAnsiTheme="majorHAnsi" w:eastAsiaTheme="majorEastAsia" w:cstheme="majorBidi"/>
       <w:spacing w:val="-10"/>
       <w:kern w:val="28"/>
       <w:sz w:val="56"/>
       <w:szCs w:val="56"/>
     </w:rPr>
   </w:style>
-  <w:style w:type="character" w:customStyle="1" w:styleId="TtuloCar">
+  <w:style w:type="character" w:styleId="TtuloCar" w:customStyle="1">
     <w:name w:val="Título Car"/>
     <w:basedOn w:val="Fuentedeprrafopredeter"/>
     <w:link w:val="Ttulo"/>
     <w:uiPriority w:val="10"/>
     <w:rsid w:val="00260138"/>
     <w:rPr>
-      <w:rFonts w:asciiTheme="majorHAnsi" w:eastAsiaTheme="majorEastAsia" w:hAnsiTheme="majorHAnsi" w:cstheme="majorBidi"/>
+      <w:rFonts w:asciiTheme="majorHAnsi" w:hAnsiTheme="majorHAnsi" w:eastAsiaTheme="majorEastAsia" w:cstheme="majorBidi"/>
       <w:spacing w:val="-10"/>
       <w:kern w:val="28"/>
       <w:sz w:val="56"/>
@@ -1822,7 +2498,7 @@
       <w:szCs w:val="28"/>
     </w:rPr>
   </w:style>
-  <w:style w:type="character" w:customStyle="1" w:styleId="SubttuloCar">
+  <w:style w:type="character" w:styleId="SubttuloCar" w:customStyle="1">
     <w:name w:val="Subtítulo Car"/>
     <w:basedOn w:val="Fuentedeprrafopredeter"/>
     <w:link w:val="Subttulo"/>
@@ -1854,7 +2530,7 @@
       <w:color w:val="404040" w:themeColor="text1" w:themeTint="BF"/>
     </w:rPr>
   </w:style>
-  <w:style w:type="character" w:customStyle="1" w:styleId="CitaCar">
+  <w:style w:type="character" w:styleId="CitaCar" w:customStyle="1">
     <w:name w:val="Cita Car"/>
     <w:basedOn w:val="Fuentedeprrafopredeter"/>
     <w:link w:val="Cita"/>
@@ -1899,8 +2575,8 @@
     <w:rsid w:val="00260138"/>
     <w:pPr>
       <w:pBdr>
-        <w:top w:val="single" w:sz="4" w:space="10" w:color="365F91" w:themeColor="accent1" w:themeShade="BF"/>
-        <w:bottom w:val="single" w:sz="4" w:space="10" w:color="365F91" w:themeColor="accent1" w:themeShade="BF"/>
+        <w:top w:val="single" w:color="365F91" w:themeColor="accent1" w:themeShade="BF" w:sz="4" w:space="10"/>
+        <w:bottom w:val="single" w:color="365F91" w:themeColor="accent1" w:themeShade="BF" w:sz="4" w:space="10"/>
       </w:pBdr>
       <w:spacing w:before="360" w:after="360"/>
       <w:ind w:left="864" w:right="864"/>
@@ -1912,7 +2588,7 @@
       <w:color w:val="365F91" w:themeColor="accent1" w:themeShade="BF"/>
     </w:rPr>
   </w:style>
-  <w:style w:type="character" w:customStyle="1" w:styleId="CitadestacadaCar">
+  <w:style w:type="character" w:styleId="CitadestacadaCar" w:customStyle="1">
     <w:name w:val="Cita destacada Car"/>
     <w:basedOn w:val="Fuentedeprrafopredeter"/>
     <w:link w:val="Citadestacada"/>
@@ -1942,7 +2618,7 @@
 </file>
 
 <file path=word/theme/theme1.xml><?xml version="1.0" encoding="utf-8"?>
-<a:theme xmlns:a="http://schemas.openxmlformats.org/drawingml/2006/main" name="Tema de Office">
+<a:theme xmlns:a="http://schemas.openxmlformats.org/drawingml/2006/main" xmlns:thm15="http://schemas.microsoft.com/office/thememl/2012/main" name="Tema de Office">
   <a:themeElements>
     <a:clrScheme name="Personalizado 1">
       <a:dk1>

</xml_diff>